<commit_message>
add .xls exemple, and resume and dashboard test in docs
</commit_message>
<xml_diff>
--- a/src/main/resources/static/docs/Pesquisa_IA_Resumo_e_Orientacao.docx
+++ b/src/main/resources/static/docs/Pesquisa_IA_Resumo_e_Orientacao.docx
@@ -11,31 +11,7 @@
       </w:pPr>
       <w:r>
         <w:rPr/>
-        <w:t xml:space="preserve">Sistema de análise da pesquisa sobre </w:t>
-      </w:r>
-      <w:r>
-        <w:rPr/>
-        <w:t>i</w:t>
-      </w:r>
-      <w:r>
-        <w:rPr/>
-        <w:t xml:space="preserve">nteligência </w:t>
-      </w:r>
-      <w:r>
-        <w:rPr/>
-        <w:t>a</w:t>
-      </w:r>
-      <w:r>
-        <w:rPr/>
-        <w:t xml:space="preserve">rtificial na </w:t>
-      </w:r>
-      <w:r>
-        <w:rPr/>
-        <w:t>a</w:t>
-      </w:r>
-      <w:r>
-        <w:rPr/>
-        <w:t>uditoria</w:t>
+        <w:t>Sistema de análise da pesquisa sobre inteligência artificial na auditoria</w:t>
       </w:r>
     </w:p>
     <w:p>
@@ -98,12 +74,28 @@
       </w:pPr>
       <w:r>
         <w:rPr/>
-        <w:t>O sistema não substitui a análise da pesquisadora. Ele funciona como uma ferramenta de processamento, organização e apoio à interpretação dos dados.</w:t>
-      </w:r>
-    </w:p>
-    <w:p>
-      <w:pPr>
-        <w:pStyle w:val="Linhahorizontal"/>
+        <w:t>O sistema não substitui a análise d</w:t>
+      </w:r>
+      <w:r>
+        <w:rPr/>
+        <w:t>os</w:t>
+      </w:r>
+      <w:r>
+        <w:rPr/>
+        <w:t xml:space="preserve"> pesquisador</w:t>
+      </w:r>
+      <w:r>
+        <w:rPr/>
+        <w:t>es</w:t>
+      </w:r>
+      <w:r>
+        <w:rPr/>
+        <w:t>. Ele funciona como uma ferramenta de processamento, organização e apoio à interpretação dos dados.</w:t>
+      </w:r>
+    </w:p>
+    <w:p>
+      <w:pPr>
+        <w:pStyle w:val="Linhahorizontaluser"/>
         <w:bidi w:val="0"/>
         <w:rPr/>
       </w:pPr>
@@ -264,7 +256,6 @@
           <w:numId w:val="1"/>
         </w:numPr>
         <w:tabs>
-          <w:tab w:val="clear" w:pos="709"/>
           <w:tab w:val="left" w:pos="709" w:leader="none"/>
         </w:tabs>
         <w:bidi w:val="0"/>
@@ -284,7 +275,6 @@
           <w:numId w:val="1"/>
         </w:numPr>
         <w:tabs>
-          <w:tab w:val="clear" w:pos="709"/>
           <w:tab w:val="left" w:pos="709" w:leader="none"/>
         </w:tabs>
         <w:bidi w:val="0"/>
@@ -304,7 +294,6 @@
           <w:numId w:val="1"/>
         </w:numPr>
         <w:tabs>
-          <w:tab w:val="clear" w:pos="709"/>
           <w:tab w:val="left" w:pos="709" w:leader="none"/>
         </w:tabs>
         <w:bidi w:val="0"/>
@@ -324,7 +313,6 @@
           <w:numId w:val="1"/>
         </w:numPr>
         <w:tabs>
-          <w:tab w:val="clear" w:pos="709"/>
           <w:tab w:val="left" w:pos="709" w:leader="none"/>
         </w:tabs>
         <w:bidi w:val="0"/>
@@ -344,7 +332,6 @@
           <w:numId w:val="1"/>
         </w:numPr>
         <w:tabs>
-          <w:tab w:val="clear" w:pos="709"/>
           <w:tab w:val="left" w:pos="709" w:leader="none"/>
         </w:tabs>
         <w:bidi w:val="0"/>
@@ -364,7 +351,6 @@
           <w:numId w:val="1"/>
         </w:numPr>
         <w:tabs>
-          <w:tab w:val="clear" w:pos="709"/>
           <w:tab w:val="left" w:pos="709" w:leader="none"/>
         </w:tabs>
         <w:bidi w:val="0"/>
@@ -384,7 +370,6 @@
           <w:numId w:val="1"/>
         </w:numPr>
         <w:tabs>
-          <w:tab w:val="clear" w:pos="709"/>
           <w:tab w:val="left" w:pos="709" w:leader="none"/>
         </w:tabs>
         <w:bidi w:val="0"/>
@@ -404,7 +389,6 @@
           <w:numId w:val="1"/>
         </w:numPr>
         <w:tabs>
-          <w:tab w:val="clear" w:pos="709"/>
           <w:tab w:val="left" w:pos="709" w:leader="none"/>
         </w:tabs>
         <w:bidi w:val="0"/>
@@ -424,7 +408,6 @@
           <w:numId w:val="1"/>
         </w:numPr>
         <w:tabs>
-          <w:tab w:val="clear" w:pos="709"/>
           <w:tab w:val="left" w:pos="709" w:leader="none"/>
         </w:tabs>
         <w:bidi w:val="0"/>
@@ -444,7 +427,6 @@
           <w:numId w:val="1"/>
         </w:numPr>
         <w:tabs>
-          <w:tab w:val="clear" w:pos="709"/>
           <w:tab w:val="left" w:pos="709" w:leader="none"/>
         </w:tabs>
         <w:bidi w:val="0"/>
@@ -464,7 +446,6 @@
           <w:numId w:val="1"/>
         </w:numPr>
         <w:tabs>
-          <w:tab w:val="clear" w:pos="709"/>
           <w:tab w:val="left" w:pos="709" w:leader="none"/>
         </w:tabs>
         <w:bidi w:val="0"/>
@@ -484,7 +465,6 @@
           <w:numId w:val="1"/>
         </w:numPr>
         <w:tabs>
-          <w:tab w:val="clear" w:pos="709"/>
           <w:tab w:val="left" w:pos="709" w:leader="none"/>
         </w:tabs>
         <w:bidi w:val="0"/>
@@ -504,7 +484,6 @@
           <w:numId w:val="1"/>
         </w:numPr>
         <w:tabs>
-          <w:tab w:val="clear" w:pos="709"/>
           <w:tab w:val="left" w:pos="709" w:leader="none"/>
         </w:tabs>
         <w:bidi w:val="0"/>
@@ -524,7 +503,6 @@
           <w:numId w:val="1"/>
         </w:numPr>
         <w:tabs>
-          <w:tab w:val="clear" w:pos="709"/>
           <w:tab w:val="left" w:pos="709" w:leader="none"/>
         </w:tabs>
         <w:bidi w:val="0"/>
@@ -544,7 +522,6 @@
           <w:numId w:val="1"/>
         </w:numPr>
         <w:tabs>
-          <w:tab w:val="clear" w:pos="709"/>
           <w:tab w:val="left" w:pos="709" w:leader="none"/>
         </w:tabs>
         <w:bidi w:val="0"/>
@@ -564,7 +541,6 @@
           <w:numId w:val="1"/>
         </w:numPr>
         <w:tabs>
-          <w:tab w:val="clear" w:pos="709"/>
           <w:tab w:val="left" w:pos="709" w:leader="none"/>
         </w:tabs>
         <w:bidi w:val="0"/>
@@ -584,7 +560,6 @@
           <w:numId w:val="1"/>
         </w:numPr>
         <w:tabs>
-          <w:tab w:val="clear" w:pos="709"/>
           <w:tab w:val="left" w:pos="709" w:leader="none"/>
         </w:tabs>
         <w:bidi w:val="0"/>
@@ -604,7 +579,6 @@
           <w:numId w:val="1"/>
         </w:numPr>
         <w:tabs>
-          <w:tab w:val="clear" w:pos="709"/>
           <w:tab w:val="left" w:pos="709" w:leader="none"/>
         </w:tabs>
         <w:bidi w:val="0"/>
@@ -624,7 +598,6 @@
           <w:numId w:val="1"/>
         </w:numPr>
         <w:tabs>
-          <w:tab w:val="clear" w:pos="709"/>
           <w:tab w:val="left" w:pos="709" w:leader="none"/>
         </w:tabs>
         <w:bidi w:val="0"/>
@@ -662,11 +635,13 @@
       <w:r>
         <w:rPr/>
         <w:t xml:space="preserve"> o indicador geral de percepção utilizado pelo sistema é um indicador descritivo construído a partir da média dos itens da pesquisa. Ele não deve ser apresentado no artigo como uma escala psicométrica validada sem uma análise metodológica adicional.</w:t>
-      </w:r>
-    </w:p>
-    <w:p>
-      <w:pPr>
-        <w:pStyle w:val="Linhahorizontal"/>
+        <w:br/>
+        <w:br/>
+      </w:r>
+    </w:p>
+    <w:p>
+      <w:pPr>
+        <w:pStyle w:val="Linhahorizontaluser"/>
         <w:bidi w:val="0"/>
         <w:rPr/>
       </w:pPr>
@@ -769,7 +744,6 @@
           <w:numId w:val="2"/>
         </w:numPr>
         <w:tabs>
-          <w:tab w:val="clear" w:pos="709"/>
           <w:tab w:val="left" w:pos="709" w:leader="none"/>
         </w:tabs>
         <w:bidi w:val="0"/>
@@ -789,7 +763,6 @@
           <w:numId w:val="2"/>
         </w:numPr>
         <w:tabs>
-          <w:tab w:val="clear" w:pos="709"/>
           <w:tab w:val="left" w:pos="709" w:leader="none"/>
         </w:tabs>
         <w:bidi w:val="0"/>
@@ -809,7 +782,6 @@
           <w:numId w:val="2"/>
         </w:numPr>
         <w:tabs>
-          <w:tab w:val="clear" w:pos="709"/>
           <w:tab w:val="left" w:pos="709" w:leader="none"/>
         </w:tabs>
         <w:bidi w:val="0"/>
@@ -829,7 +801,6 @@
           <w:numId w:val="2"/>
         </w:numPr>
         <w:tabs>
-          <w:tab w:val="clear" w:pos="709"/>
           <w:tab w:val="left" w:pos="709" w:leader="none"/>
         </w:tabs>
         <w:bidi w:val="0"/>
@@ -849,7 +820,6 @@
           <w:numId w:val="2"/>
         </w:numPr>
         <w:tabs>
-          <w:tab w:val="clear" w:pos="709"/>
           <w:tab w:val="left" w:pos="709" w:leader="none"/>
         </w:tabs>
         <w:bidi w:val="0"/>
@@ -869,7 +839,6 @@
           <w:numId w:val="2"/>
         </w:numPr>
         <w:tabs>
-          <w:tab w:val="clear" w:pos="709"/>
           <w:tab w:val="left" w:pos="709" w:leader="none"/>
         </w:tabs>
         <w:bidi w:val="0"/>
@@ -889,7 +858,6 @@
           <w:numId w:val="2"/>
         </w:numPr>
         <w:tabs>
-          <w:tab w:val="clear" w:pos="709"/>
           <w:tab w:val="left" w:pos="709" w:leader="none"/>
         </w:tabs>
         <w:bidi w:val="0"/>
@@ -909,7 +877,6 @@
           <w:numId w:val="2"/>
         </w:numPr>
         <w:tabs>
-          <w:tab w:val="clear" w:pos="709"/>
           <w:tab w:val="left" w:pos="709" w:leader="none"/>
         </w:tabs>
         <w:bidi w:val="0"/>
@@ -929,7 +896,6 @@
           <w:numId w:val="2"/>
         </w:numPr>
         <w:tabs>
-          <w:tab w:val="clear" w:pos="709"/>
           <w:tab w:val="left" w:pos="709" w:leader="none"/>
         </w:tabs>
         <w:bidi w:val="0"/>
@@ -949,7 +915,6 @@
           <w:numId w:val="2"/>
         </w:numPr>
         <w:tabs>
-          <w:tab w:val="clear" w:pos="709"/>
           <w:tab w:val="left" w:pos="709" w:leader="none"/>
         </w:tabs>
         <w:bidi w:val="0"/>
@@ -969,7 +934,6 @@
           <w:numId w:val="2"/>
         </w:numPr>
         <w:tabs>
-          <w:tab w:val="clear" w:pos="709"/>
           <w:tab w:val="left" w:pos="709" w:leader="none"/>
         </w:tabs>
         <w:bidi w:val="0"/>
@@ -1011,7 +975,6 @@
           <w:numId w:val="3"/>
         </w:numPr>
         <w:tabs>
-          <w:tab w:val="clear" w:pos="709"/>
           <w:tab w:val="left" w:pos="709" w:leader="none"/>
         </w:tabs>
         <w:bidi w:val="0"/>
@@ -1031,7 +994,6 @@
           <w:numId w:val="3"/>
         </w:numPr>
         <w:tabs>
-          <w:tab w:val="clear" w:pos="709"/>
           <w:tab w:val="left" w:pos="709" w:leader="none"/>
         </w:tabs>
         <w:bidi w:val="0"/>
@@ -1051,7 +1013,6 @@
           <w:numId w:val="3"/>
         </w:numPr>
         <w:tabs>
-          <w:tab w:val="clear" w:pos="709"/>
           <w:tab w:val="left" w:pos="709" w:leader="none"/>
         </w:tabs>
         <w:bidi w:val="0"/>
@@ -1071,7 +1032,6 @@
           <w:numId w:val="3"/>
         </w:numPr>
         <w:tabs>
-          <w:tab w:val="clear" w:pos="709"/>
           <w:tab w:val="left" w:pos="709" w:leader="none"/>
         </w:tabs>
         <w:bidi w:val="0"/>
@@ -1091,7 +1051,6 @@
           <w:numId w:val="3"/>
         </w:numPr>
         <w:tabs>
-          <w:tab w:val="clear" w:pos="709"/>
           <w:tab w:val="left" w:pos="709" w:leader="none"/>
         </w:tabs>
         <w:bidi w:val="0"/>
@@ -1111,7 +1070,6 @@
           <w:numId w:val="3"/>
         </w:numPr>
         <w:tabs>
-          <w:tab w:val="clear" w:pos="709"/>
           <w:tab w:val="left" w:pos="709" w:leader="none"/>
         </w:tabs>
         <w:bidi w:val="0"/>
@@ -1131,7 +1089,6 @@
           <w:numId w:val="3"/>
         </w:numPr>
         <w:tabs>
-          <w:tab w:val="clear" w:pos="709"/>
           <w:tab w:val="left" w:pos="709" w:leader="none"/>
         </w:tabs>
         <w:bidi w:val="0"/>
@@ -1151,7 +1108,6 @@
           <w:numId w:val="3"/>
         </w:numPr>
         <w:tabs>
-          <w:tab w:val="clear" w:pos="709"/>
           <w:tab w:val="left" w:pos="709" w:leader="none"/>
         </w:tabs>
         <w:bidi w:val="0"/>
@@ -1171,7 +1127,6 @@
           <w:numId w:val="3"/>
         </w:numPr>
         <w:tabs>
-          <w:tab w:val="clear" w:pos="709"/>
           <w:tab w:val="left" w:pos="709" w:leader="none"/>
         </w:tabs>
         <w:bidi w:val="0"/>
@@ -1191,7 +1146,6 @@
           <w:numId w:val="3"/>
         </w:numPr>
         <w:tabs>
-          <w:tab w:val="clear" w:pos="709"/>
           <w:tab w:val="left" w:pos="709" w:leader="none"/>
         </w:tabs>
         <w:bidi w:val="0"/>
@@ -1233,7 +1187,6 @@
           <w:numId w:val="4"/>
         </w:numPr>
         <w:tabs>
-          <w:tab w:val="clear" w:pos="709"/>
           <w:tab w:val="left" w:pos="709" w:leader="none"/>
         </w:tabs>
         <w:bidi w:val="0"/>
@@ -1253,7 +1206,6 @@
           <w:numId w:val="4"/>
         </w:numPr>
         <w:tabs>
-          <w:tab w:val="clear" w:pos="709"/>
           <w:tab w:val="left" w:pos="709" w:leader="none"/>
         </w:tabs>
         <w:bidi w:val="0"/>
@@ -1273,7 +1225,6 @@
           <w:numId w:val="4"/>
         </w:numPr>
         <w:tabs>
-          <w:tab w:val="clear" w:pos="709"/>
           <w:tab w:val="left" w:pos="709" w:leader="none"/>
         </w:tabs>
         <w:bidi w:val="0"/>
@@ -1293,7 +1244,6 @@
           <w:numId w:val="4"/>
         </w:numPr>
         <w:tabs>
-          <w:tab w:val="clear" w:pos="709"/>
           <w:tab w:val="left" w:pos="709" w:leader="none"/>
         </w:tabs>
         <w:bidi w:val="0"/>
@@ -1313,7 +1263,6 @@
           <w:numId w:val="4"/>
         </w:numPr>
         <w:tabs>
-          <w:tab w:val="clear" w:pos="709"/>
           <w:tab w:val="left" w:pos="709" w:leader="none"/>
         </w:tabs>
         <w:bidi w:val="0"/>
@@ -1333,7 +1282,6 @@
           <w:numId w:val="4"/>
         </w:numPr>
         <w:tabs>
-          <w:tab w:val="clear" w:pos="709"/>
           <w:tab w:val="left" w:pos="709" w:leader="none"/>
         </w:tabs>
         <w:bidi w:val="0"/>
@@ -1353,7 +1301,6 @@
           <w:numId w:val="4"/>
         </w:numPr>
         <w:tabs>
-          <w:tab w:val="clear" w:pos="709"/>
           <w:tab w:val="left" w:pos="709" w:leader="none"/>
         </w:tabs>
         <w:bidi w:val="0"/>
@@ -1373,7 +1320,6 @@
           <w:numId w:val="4"/>
         </w:numPr>
         <w:tabs>
-          <w:tab w:val="clear" w:pos="709"/>
           <w:tab w:val="left" w:pos="709" w:leader="none"/>
         </w:tabs>
         <w:bidi w:val="0"/>
@@ -1393,7 +1339,6 @@
           <w:numId w:val="4"/>
         </w:numPr>
         <w:tabs>
-          <w:tab w:val="clear" w:pos="709"/>
           <w:tab w:val="left" w:pos="709" w:leader="none"/>
         </w:tabs>
         <w:bidi w:val="0"/>
@@ -1413,7 +1358,6 @@
           <w:numId w:val="4"/>
         </w:numPr>
         <w:tabs>
-          <w:tab w:val="clear" w:pos="709"/>
           <w:tab w:val="left" w:pos="709" w:leader="none"/>
         </w:tabs>
         <w:bidi w:val="0"/>
@@ -1433,7 +1377,6 @@
           <w:numId w:val="4"/>
         </w:numPr>
         <w:tabs>
-          <w:tab w:val="clear" w:pos="709"/>
           <w:tab w:val="left" w:pos="709" w:leader="none"/>
         </w:tabs>
         <w:bidi w:val="0"/>
@@ -1453,7 +1396,6 @@
           <w:numId w:val="4"/>
         </w:numPr>
         <w:tabs>
-          <w:tab w:val="clear" w:pos="709"/>
           <w:tab w:val="left" w:pos="709" w:leader="none"/>
         </w:tabs>
         <w:bidi w:val="0"/>
@@ -1473,7 +1415,6 @@
           <w:numId w:val="4"/>
         </w:numPr>
         <w:tabs>
-          <w:tab w:val="clear" w:pos="709"/>
           <w:tab w:val="left" w:pos="709" w:leader="none"/>
         </w:tabs>
         <w:bidi w:val="0"/>
@@ -1493,7 +1434,6 @@
           <w:numId w:val="4"/>
         </w:numPr>
         <w:tabs>
-          <w:tab w:val="clear" w:pos="709"/>
           <w:tab w:val="left" w:pos="709" w:leader="none"/>
         </w:tabs>
         <w:bidi w:val="0"/>
@@ -1535,7 +1475,6 @@
           <w:numId w:val="5"/>
         </w:numPr>
         <w:tabs>
-          <w:tab w:val="clear" w:pos="709"/>
           <w:tab w:val="left" w:pos="709" w:leader="none"/>
         </w:tabs>
         <w:bidi w:val="0"/>
@@ -1555,7 +1494,6 @@
           <w:numId w:val="5"/>
         </w:numPr>
         <w:tabs>
-          <w:tab w:val="clear" w:pos="709"/>
           <w:tab w:val="left" w:pos="709" w:leader="none"/>
         </w:tabs>
         <w:bidi w:val="0"/>
@@ -1575,7 +1513,6 @@
           <w:numId w:val="5"/>
         </w:numPr>
         <w:tabs>
-          <w:tab w:val="clear" w:pos="709"/>
           <w:tab w:val="left" w:pos="709" w:leader="none"/>
         </w:tabs>
         <w:bidi w:val="0"/>
@@ -1595,7 +1532,6 @@
           <w:numId w:val="5"/>
         </w:numPr>
         <w:tabs>
-          <w:tab w:val="clear" w:pos="709"/>
           <w:tab w:val="left" w:pos="709" w:leader="none"/>
         </w:tabs>
         <w:bidi w:val="0"/>
@@ -1615,7 +1551,6 @@
           <w:numId w:val="5"/>
         </w:numPr>
         <w:tabs>
-          <w:tab w:val="clear" w:pos="709"/>
           <w:tab w:val="left" w:pos="709" w:leader="none"/>
         </w:tabs>
         <w:bidi w:val="0"/>
@@ -1635,7 +1570,6 @@
           <w:numId w:val="5"/>
         </w:numPr>
         <w:tabs>
-          <w:tab w:val="clear" w:pos="709"/>
           <w:tab w:val="left" w:pos="709" w:leader="none"/>
         </w:tabs>
         <w:bidi w:val="0"/>
@@ -1655,7 +1589,6 @@
           <w:numId w:val="5"/>
         </w:numPr>
         <w:tabs>
-          <w:tab w:val="clear" w:pos="709"/>
           <w:tab w:val="left" w:pos="709" w:leader="none"/>
         </w:tabs>
         <w:bidi w:val="0"/>
@@ -1675,7 +1608,6 @@
           <w:numId w:val="5"/>
         </w:numPr>
         <w:tabs>
-          <w:tab w:val="clear" w:pos="709"/>
           <w:tab w:val="left" w:pos="709" w:leader="none"/>
         </w:tabs>
         <w:bidi w:val="0"/>
@@ -1695,7 +1627,6 @@
           <w:numId w:val="5"/>
         </w:numPr>
         <w:tabs>
-          <w:tab w:val="clear" w:pos="709"/>
           <w:tab w:val="left" w:pos="709" w:leader="none"/>
         </w:tabs>
         <w:bidi w:val="0"/>
@@ -1737,7 +1668,6 @@
           <w:numId w:val="6"/>
         </w:numPr>
         <w:tabs>
-          <w:tab w:val="clear" w:pos="709"/>
           <w:tab w:val="left" w:pos="709" w:leader="none"/>
         </w:tabs>
         <w:bidi w:val="0"/>
@@ -1757,7 +1687,6 @@
           <w:numId w:val="6"/>
         </w:numPr>
         <w:tabs>
-          <w:tab w:val="clear" w:pos="709"/>
           <w:tab w:val="left" w:pos="709" w:leader="none"/>
         </w:tabs>
         <w:bidi w:val="0"/>
@@ -1777,7 +1706,6 @@
           <w:numId w:val="6"/>
         </w:numPr>
         <w:tabs>
-          <w:tab w:val="clear" w:pos="709"/>
           <w:tab w:val="left" w:pos="709" w:leader="none"/>
         </w:tabs>
         <w:bidi w:val="0"/>
@@ -1797,7 +1725,6 @@
           <w:numId w:val="6"/>
         </w:numPr>
         <w:tabs>
-          <w:tab w:val="clear" w:pos="709"/>
           <w:tab w:val="left" w:pos="709" w:leader="none"/>
         </w:tabs>
         <w:bidi w:val="0"/>
@@ -1817,7 +1744,6 @@
           <w:numId w:val="6"/>
         </w:numPr>
         <w:tabs>
-          <w:tab w:val="clear" w:pos="709"/>
           <w:tab w:val="left" w:pos="709" w:leader="none"/>
         </w:tabs>
         <w:bidi w:val="0"/>
@@ -1837,7 +1763,6 @@
           <w:numId w:val="6"/>
         </w:numPr>
         <w:tabs>
-          <w:tab w:val="clear" w:pos="709"/>
           <w:tab w:val="left" w:pos="709" w:leader="none"/>
         </w:tabs>
         <w:bidi w:val="0"/>
@@ -1857,7 +1782,6 @@
           <w:numId w:val="6"/>
         </w:numPr>
         <w:tabs>
-          <w:tab w:val="clear" w:pos="709"/>
           <w:tab w:val="left" w:pos="709" w:leader="none"/>
         </w:tabs>
         <w:bidi w:val="0"/>
@@ -1877,7 +1801,6 @@
           <w:numId w:val="6"/>
         </w:numPr>
         <w:tabs>
-          <w:tab w:val="clear" w:pos="709"/>
           <w:tab w:val="left" w:pos="709" w:leader="none"/>
         </w:tabs>
         <w:bidi w:val="0"/>
@@ -1897,7 +1820,6 @@
           <w:numId w:val="6"/>
         </w:numPr>
         <w:tabs>
-          <w:tab w:val="clear" w:pos="709"/>
           <w:tab w:val="left" w:pos="709" w:leader="none"/>
         </w:tabs>
         <w:bidi w:val="0"/>
@@ -1939,7 +1861,6 @@
           <w:numId w:val="7"/>
         </w:numPr>
         <w:tabs>
-          <w:tab w:val="clear" w:pos="709"/>
           <w:tab w:val="left" w:pos="709" w:leader="none"/>
         </w:tabs>
         <w:bidi w:val="0"/>
@@ -1959,7 +1880,6 @@
           <w:numId w:val="7"/>
         </w:numPr>
         <w:tabs>
-          <w:tab w:val="clear" w:pos="709"/>
           <w:tab w:val="left" w:pos="709" w:leader="none"/>
         </w:tabs>
         <w:bidi w:val="0"/>
@@ -1979,7 +1899,6 @@
           <w:numId w:val="7"/>
         </w:numPr>
         <w:tabs>
-          <w:tab w:val="clear" w:pos="709"/>
           <w:tab w:val="left" w:pos="709" w:leader="none"/>
         </w:tabs>
         <w:bidi w:val="0"/>
@@ -1999,7 +1918,6 @@
           <w:numId w:val="7"/>
         </w:numPr>
         <w:tabs>
-          <w:tab w:val="clear" w:pos="709"/>
           <w:tab w:val="left" w:pos="709" w:leader="none"/>
         </w:tabs>
         <w:bidi w:val="0"/>
@@ -2019,7 +1937,6 @@
           <w:numId w:val="7"/>
         </w:numPr>
         <w:tabs>
-          <w:tab w:val="clear" w:pos="709"/>
           <w:tab w:val="left" w:pos="709" w:leader="none"/>
         </w:tabs>
         <w:bidi w:val="0"/>
@@ -2039,7 +1956,6 @@
           <w:numId w:val="7"/>
         </w:numPr>
         <w:tabs>
-          <w:tab w:val="clear" w:pos="709"/>
           <w:tab w:val="left" w:pos="709" w:leader="none"/>
         </w:tabs>
         <w:bidi w:val="0"/>
@@ -2059,7 +1975,6 @@
           <w:numId w:val="7"/>
         </w:numPr>
         <w:tabs>
-          <w:tab w:val="clear" w:pos="709"/>
           <w:tab w:val="left" w:pos="709" w:leader="none"/>
         </w:tabs>
         <w:bidi w:val="0"/>
@@ -2079,7 +1994,6 @@
           <w:numId w:val="7"/>
         </w:numPr>
         <w:tabs>
-          <w:tab w:val="clear" w:pos="709"/>
           <w:tab w:val="left" w:pos="709" w:leader="none"/>
         </w:tabs>
         <w:bidi w:val="0"/>
@@ -2099,7 +2013,6 @@
           <w:numId w:val="7"/>
         </w:numPr>
         <w:tabs>
-          <w:tab w:val="clear" w:pos="709"/>
           <w:tab w:val="left" w:pos="709" w:leader="none"/>
         </w:tabs>
         <w:bidi w:val="0"/>
@@ -2119,7 +2032,6 @@
           <w:numId w:val="7"/>
         </w:numPr>
         <w:tabs>
-          <w:tab w:val="clear" w:pos="709"/>
           <w:tab w:val="left" w:pos="709" w:leader="none"/>
         </w:tabs>
         <w:bidi w:val="0"/>
@@ -2133,7 +2045,7 @@
     </w:p>
     <w:p>
       <w:pPr>
-        <w:pStyle w:val="Linhahorizontal"/>
+        <w:pStyle w:val="Linhahorizontaluser"/>
         <w:bidi w:val="0"/>
         <w:rPr/>
       </w:pPr>
@@ -2193,7 +2105,6 @@
           <w:numId w:val="8"/>
         </w:numPr>
         <w:tabs>
-          <w:tab w:val="clear" w:pos="709"/>
           <w:tab w:val="left" w:pos="709" w:leader="none"/>
         </w:tabs>
         <w:bidi w:val="0"/>
@@ -2213,7 +2124,6 @@
           <w:numId w:val="8"/>
         </w:numPr>
         <w:tabs>
-          <w:tab w:val="clear" w:pos="709"/>
           <w:tab w:val="left" w:pos="709" w:leader="none"/>
         </w:tabs>
         <w:bidi w:val="0"/>
@@ -2233,7 +2143,6 @@
           <w:numId w:val="8"/>
         </w:numPr>
         <w:tabs>
-          <w:tab w:val="clear" w:pos="709"/>
           <w:tab w:val="left" w:pos="709" w:leader="none"/>
         </w:tabs>
         <w:bidi w:val="0"/>
@@ -2253,7 +2162,6 @@
           <w:numId w:val="8"/>
         </w:numPr>
         <w:tabs>
-          <w:tab w:val="clear" w:pos="709"/>
           <w:tab w:val="left" w:pos="709" w:leader="none"/>
         </w:tabs>
         <w:bidi w:val="0"/>
@@ -2273,7 +2181,6 @@
           <w:numId w:val="8"/>
         </w:numPr>
         <w:tabs>
-          <w:tab w:val="clear" w:pos="709"/>
           <w:tab w:val="left" w:pos="709" w:leader="none"/>
         </w:tabs>
         <w:bidi w:val="0"/>
@@ -2293,7 +2200,6 @@
           <w:numId w:val="8"/>
         </w:numPr>
         <w:tabs>
-          <w:tab w:val="clear" w:pos="709"/>
           <w:tab w:val="left" w:pos="709" w:leader="none"/>
         </w:tabs>
         <w:bidi w:val="0"/>
@@ -2328,7 +2234,500 @@
     </w:p>
     <w:p>
       <w:pPr>
-        <w:pStyle w:val="Linhahorizontal"/>
+        <w:pStyle w:val="BodyText"/>
+        <w:bidi w:val="0"/>
+        <w:rPr/>
+      </w:pPr>
+      <w:r>
+        <w:rPr/>
+      </w:r>
+    </w:p>
+    <w:p>
+      <w:pPr>
+        <w:pStyle w:val="Normal"/>
+        <w:bidi w:val="0"/>
+        <w:rPr/>
+      </w:pPr>
+      <w:r>
+        <w:rPr/>
+        <w:t>FLUXO:</w:t>
+        <w:br/>
+      </w:r>
+      <w:r>
+        <w:rPr/>
+        <w:t>=======================================</w:t>
+      </w:r>
+      <w:r>
+        <w:rPr/>
+        <w:br/>
+        <w:t>Google Forms / XLSX</w:t>
+      </w:r>
+    </w:p>
+    <w:p>
+      <w:pPr>
+        <w:pStyle w:val="BodyText"/>
+        <w:bidi w:val="0"/>
+        <w:rPr/>
+      </w:pPr>
+      <w:r>
+        <w:rPr/>
+        <w:t xml:space="preserve">       ↓</w:t>
+      </w:r>
+    </w:p>
+    <w:p>
+      <w:pPr>
+        <w:pStyle w:val="BodyText"/>
+        <w:bidi w:val="0"/>
+        <w:rPr/>
+      </w:pPr>
+      <w:r>
+        <w:rPr/>
+        <w:t>ResearchResponse</w:t>
+      </w:r>
+    </w:p>
+    <w:p>
+      <w:pPr>
+        <w:pStyle w:val="BodyText"/>
+        <w:bidi w:val="0"/>
+        <w:rPr/>
+      </w:pPr>
+      <w:r>
+        <w:rPr/>
+        <w:t xml:space="preserve">       ↓</w:t>
+      </w:r>
+    </w:p>
+    <w:p>
+      <w:pPr>
+        <w:pStyle w:val="BodyText"/>
+        <w:bidi w:val="0"/>
+        <w:rPr/>
+      </w:pPr>
+      <w:r>
+        <w:rPr/>
+        <w:t>Respostas abertas</w:t>
+      </w:r>
+    </w:p>
+    <w:p>
+      <w:pPr>
+        <w:pStyle w:val="BodyText"/>
+        <w:bidi w:val="0"/>
+        <w:rPr/>
+      </w:pPr>
+      <w:r>
+        <w:rPr/>
+        <w:t>(openActivities</w:t>
+      </w:r>
+    </w:p>
+    <w:p>
+      <w:pPr>
+        <w:pStyle w:val="BodyText"/>
+        <w:bidi w:val="0"/>
+        <w:rPr/>
+      </w:pPr>
+      <w:r>
+        <w:rPr/>
+        <w:t xml:space="preserve"> </w:t>
+      </w:r>
+      <w:r>
+        <w:rPr/>
+        <w:t>openBenefits</w:t>
+      </w:r>
+    </w:p>
+    <w:p>
+      <w:pPr>
+        <w:pStyle w:val="BodyText"/>
+        <w:bidi w:val="0"/>
+        <w:rPr/>
+      </w:pPr>
+      <w:r>
+        <w:rPr/>
+        <w:t xml:space="preserve"> </w:t>
+      </w:r>
+      <w:r>
+        <w:rPr/>
+        <w:t>openRisks</w:t>
+      </w:r>
+    </w:p>
+    <w:p>
+      <w:pPr>
+        <w:pStyle w:val="BodyText"/>
+        <w:bidi w:val="0"/>
+        <w:rPr/>
+      </w:pPr>
+      <w:r>
+        <w:rPr/>
+        <w:t xml:space="preserve"> </w:t>
+      </w:r>
+      <w:r>
+        <w:rPr/>
+        <w:t>openDelegation</w:t>
+      </w:r>
+    </w:p>
+    <w:p>
+      <w:pPr>
+        <w:pStyle w:val="BodyText"/>
+        <w:bidi w:val="0"/>
+        <w:rPr/>
+      </w:pPr>
+      <w:r>
+        <w:rPr/>
+        <w:t xml:space="preserve"> </w:t>
+      </w:r>
+      <w:r>
+        <w:rPr/>
+        <w:t>openFuture)</w:t>
+      </w:r>
+    </w:p>
+    <w:p>
+      <w:pPr>
+        <w:pStyle w:val="BodyText"/>
+        <w:bidi w:val="0"/>
+        <w:rPr/>
+      </w:pPr>
+      <w:r>
+        <w:rPr/>
+        <w:t xml:space="preserve">       ↓</w:t>
+      </w:r>
+    </w:p>
+    <w:p>
+      <w:pPr>
+        <w:pStyle w:val="BodyText"/>
+        <w:bidi w:val="0"/>
+        <w:rPr/>
+      </w:pPr>
+      <w:r>
+        <w:rPr/>
+        <w:t>Gemini</w:t>
+      </w:r>
+    </w:p>
+    <w:p>
+      <w:pPr>
+        <w:pStyle w:val="BodyText"/>
+        <w:bidi w:val="0"/>
+        <w:rPr/>
+      </w:pPr>
+      <w:r>
+        <w:rPr/>
+        <w:t xml:space="preserve">       </w:t>
+      </w:r>
+      <w:r>
+        <w:rPr/>
+        <w:t>+</w:t>
+      </w:r>
+    </w:p>
+    <w:p>
+      <w:pPr>
+        <w:pStyle w:val="BodyText"/>
+        <w:bidi w:val="0"/>
+        <w:rPr/>
+      </w:pPr>
+      <w:r>
+        <w:rPr/>
+        <w:t>Taxonomia definida pelo pesquisador</w:t>
+      </w:r>
+    </w:p>
+    <w:p>
+      <w:pPr>
+        <w:pStyle w:val="BodyText"/>
+        <w:bidi w:val="0"/>
+        <w:rPr/>
+      </w:pPr>
+      <w:r>
+        <w:rPr/>
+        <w:t xml:space="preserve">       ↓</w:t>
+      </w:r>
+    </w:p>
+    <w:p>
+      <w:pPr>
+        <w:pStyle w:val="BodyText"/>
+        <w:bidi w:val="0"/>
+        <w:rPr/>
+      </w:pPr>
+      <w:r>
+        <w:rPr/>
+        <w:t>Classificação</w:t>
+      </w:r>
+    </w:p>
+    <w:p>
+      <w:pPr>
+        <w:pStyle w:val="BodyText"/>
+        <w:bidi w:val="0"/>
+        <w:rPr/>
+      </w:pPr>
+      <w:r>
+        <w:rPr/>
+        <w:t xml:space="preserve">       ↓</w:t>
+      </w:r>
+    </w:p>
+    <w:p>
+      <w:pPr>
+        <w:pStyle w:val="BodyText"/>
+        <w:bidi w:val="0"/>
+        <w:rPr/>
+      </w:pPr>
+      <w:r>
+        <w:rPr/>
+        <w:t>Categorias + justificativa + confiança</w:t>
+      </w:r>
+    </w:p>
+    <w:p>
+      <w:pPr>
+        <w:pStyle w:val="BodyText"/>
+        <w:bidi w:val="0"/>
+        <w:rPr/>
+      </w:pPr>
+      <w:r>
+        <w:rPr/>
+        <w:t xml:space="preserve">       ↓</w:t>
+      </w:r>
+    </w:p>
+    <w:p>
+      <w:pPr>
+        <w:pStyle w:val="BodyText"/>
+        <w:bidi w:val="0"/>
+        <w:rPr/>
+      </w:pPr>
+      <w:r>
+        <w:rPr/>
+        <w:t>Banco de dados</w:t>
+        <w:br/>
+      </w:r>
+      <w:r>
+        <w:rPr/>
+        <w:t>=========================================</w:t>
+      </w:r>
+      <w:r>
+        <w:rPr/>
+        <w:br/>
+      </w:r>
+      <w:r>
+        <w:rPr/>
+        <w:t>Em relação as respostas abertas:</w:t>
+        <w:br/>
+      </w:r>
+      <w:r>
+        <w:rPr/>
+        <w:t>Por exemplo, se o participante respondeu:</w:t>
+      </w:r>
+    </w:p>
+    <w:p>
+      <w:pPr>
+        <w:pStyle w:val="Blocodecitao"/>
+        <w:bidi w:val="0"/>
+        <w:spacing w:lineRule="auto" w:line="276" w:before="0" w:after="140"/>
+        <w:rPr/>
+      </w:pPr>
+      <w:r>
+        <w:rPr/>
+        <w:t>“</w:t>
+      </w:r>
+      <w:r>
+        <w:rPr/>
+        <w:t>A IA pode ajudar a analisar grandes volumes de documentos e encontrar inconsistências.”</w:t>
+      </w:r>
+    </w:p>
+    <w:p>
+      <w:pPr>
+        <w:pStyle w:val="BodyText"/>
+        <w:bidi w:val="0"/>
+        <w:rPr/>
+      </w:pPr>
+      <w:r>
+        <w:rPr/>
+        <w:t xml:space="preserve">Essa resposta é enviada ao Gemini junto com a taxonomia de </w:t>
+      </w:r>
+      <w:r>
+        <w:rPr>
+          <w:rStyle w:val="Strong"/>
+        </w:rPr>
+        <w:t>atividades</w:t>
+      </w:r>
+      <w:r>
+        <w:rPr/>
+        <w:t xml:space="preserve"> e </w:t>
+      </w:r>
+      <w:r>
+        <w:rPr>
+          <w:rStyle w:val="Strong"/>
+        </w:rPr>
+        <w:t>benefícios</w:t>
+      </w:r>
+      <w:r>
+        <w:rPr/>
+        <w:t>.</w:t>
+      </w:r>
+    </w:p>
+    <w:p>
+      <w:pPr>
+        <w:pStyle w:val="BodyText"/>
+        <w:bidi w:val="0"/>
+        <w:rPr/>
+      </w:pPr>
+      <w:r>
+        <w:rPr/>
+        <w:t xml:space="preserve">O Gemini então procura correspondências </w:t>
+      </w:r>
+      <w:r>
+        <w:rPr>
+          <w:rStyle w:val="Strong"/>
+        </w:rPr>
+        <w:t>dentro das categorias permitidas</w:t>
+      </w:r>
+      <w:r>
+        <w:rPr/>
+        <w:t xml:space="preserve"> e retorna algo como:</w:t>
+        <w:br/>
+        <w:br/>
+      </w:r>
+      <w:r>
+        <w:rPr/>
+        <w:t>======================================</w:t>
+      </w:r>
+    </w:p>
+    <w:p>
+      <w:pPr>
+        <w:pStyle w:val="BodyText"/>
+        <w:bidi w:val="0"/>
+        <w:rPr/>
+      </w:pPr>
+      <w:r>
+        <w:rPr/>
+        <w:t>Categorias:</w:t>
+      </w:r>
+    </w:p>
+    <w:p>
+      <w:pPr>
+        <w:pStyle w:val="BodyText"/>
+        <w:bidi w:val="0"/>
+        <w:rPr/>
+      </w:pPr>
+      <w:r>
+        <w:rPr/>
+        <w:t>- AT01 - Análise documental</w:t>
+      </w:r>
+    </w:p>
+    <w:p>
+      <w:pPr>
+        <w:pStyle w:val="BodyText"/>
+        <w:bidi w:val="0"/>
+        <w:rPr/>
+      </w:pPr>
+      <w:r>
+        <w:rPr/>
+        <w:t>- AT04 - Detecção de anomalia</w:t>
+      </w:r>
+    </w:p>
+    <w:p>
+      <w:pPr>
+        <w:pStyle w:val="BodyText"/>
+        <w:bidi w:val="0"/>
+        <w:rPr/>
+      </w:pPr>
+      <w:r>
+        <w:rPr/>
+        <w:t>Justificativa:</w:t>
+      </w:r>
+    </w:p>
+    <w:p>
+      <w:pPr>
+        <w:pStyle w:val="BodyText"/>
+        <w:bidi w:val="0"/>
+        <w:rPr/>
+      </w:pPr>
+      <w:r>
+        <w:rPr/>
+        <w:t>A resposta menciona análise de documentos e identificação</w:t>
+      </w:r>
+    </w:p>
+    <w:p>
+      <w:pPr>
+        <w:pStyle w:val="BodyText"/>
+        <w:bidi w:val="0"/>
+        <w:rPr/>
+      </w:pPr>
+      <w:r>
+        <w:rPr/>
+        <w:t>de inconsistências.</w:t>
+      </w:r>
+    </w:p>
+    <w:p>
+      <w:pPr>
+        <w:pStyle w:val="BodyText"/>
+        <w:bidi w:val="0"/>
+        <w:rPr/>
+      </w:pPr>
+      <w:r>
+        <w:rPr/>
+        <w:t>Confiança:</w:t>
+      </w:r>
+    </w:p>
+    <w:p>
+      <w:pPr>
+        <w:pStyle w:val="BodyText"/>
+        <w:bidi w:val="0"/>
+        <w:rPr/>
+      </w:pPr>
+      <w:r>
+        <w:rPr/>
+        <w:t>0.95</w:t>
+        <w:br/>
+      </w:r>
+      <w:r>
+        <w:rPr/>
+        <w:t>=======================================</w:t>
+        <w:br/>
+      </w:r>
+      <w:r>
+        <w:rPr/>
+        <w:t>Então, conceitualmente:</w:t>
+      </w:r>
+    </w:p>
+    <w:p>
+      <w:pPr>
+        <w:pStyle w:val="BodyText"/>
+        <w:bidi w:val="0"/>
+        <w:rPr/>
+      </w:pPr>
+      <w:r>
+        <w:rPr>
+          <w:rStyle w:val="Strong"/>
+        </w:rPr>
+        <w:t>Resposta aberta = dado que queremos interpretar.</w:t>
+      </w:r>
+      <w:r>
+        <w:rPr/>
+        <w:br/>
+      </w:r>
+      <w:r>
+        <w:rPr>
+          <w:rStyle w:val="Strong"/>
+        </w:rPr>
+        <w:t>Taxonomia = regra/conjunto de categorias usado para interpretar.</w:t>
+      </w:r>
+      <w:r>
+        <w:rPr/>
+        <w:br/>
+      </w:r>
+      <w:r>
+        <w:rPr>
+          <w:rStyle w:val="Strong"/>
+        </w:rPr>
+        <w:t>Gemini = classificador que faz essa associação e explica a classificação.</w:t>
+      </w:r>
+    </w:p>
+    <w:p>
+      <w:pPr>
+        <w:pStyle w:val="BodyText"/>
+        <w:bidi w:val="0"/>
+        <w:rPr/>
+      </w:pPr>
+      <w:r>
+        <w:rPr/>
+      </w:r>
+    </w:p>
+    <w:p>
+      <w:pPr>
+        <w:pStyle w:val="Linhahorizontaluser"/>
         <w:bidi w:val="0"/>
         <w:rPr/>
       </w:pPr>
@@ -2513,7 +2912,7 @@
     </w:p>
     <w:p>
       <w:pPr>
-        <w:pStyle w:val="Linhahorizontal"/>
+        <w:pStyle w:val="Linhahorizontaluser"/>
         <w:bidi w:val="0"/>
         <w:rPr/>
       </w:pPr>
@@ -2529,15 +2928,7 @@
       </w:pPr>
       <w:r>
         <w:rPr/>
-        <w:t xml:space="preserve">7. O que </w:t>
-      </w:r>
-      <w:r>
-        <w:rPr/>
-        <w:t>o pesquisador</w:t>
-      </w:r>
-      <w:r>
-        <w:rPr/>
-        <w:t xml:space="preserve"> deverá avaliar</w:t>
+        <w:t>7. O que o pesquisador deverá avaliar</w:t>
       </w:r>
     </w:p>
     <w:p>
@@ -2613,7 +3004,6 @@
           <w:numId w:val="9"/>
         </w:numPr>
         <w:tabs>
-          <w:tab w:val="clear" w:pos="709"/>
           <w:tab w:val="left" w:pos="709" w:leader="none"/>
         </w:tabs>
         <w:bidi w:val="0"/>
@@ -2633,7 +3023,6 @@
           <w:numId w:val="9"/>
         </w:numPr>
         <w:tabs>
-          <w:tab w:val="clear" w:pos="709"/>
           <w:tab w:val="left" w:pos="709" w:leader="none"/>
         </w:tabs>
         <w:bidi w:val="0"/>
@@ -2653,7 +3042,6 @@
           <w:numId w:val="9"/>
         </w:numPr>
         <w:tabs>
-          <w:tab w:val="clear" w:pos="709"/>
           <w:tab w:val="left" w:pos="709" w:leader="none"/>
         </w:tabs>
         <w:bidi w:val="0"/>
@@ -2673,7 +3061,6 @@
           <w:numId w:val="9"/>
         </w:numPr>
         <w:tabs>
-          <w:tab w:val="clear" w:pos="709"/>
           <w:tab w:val="left" w:pos="709" w:leader="none"/>
         </w:tabs>
         <w:bidi w:val="0"/>
@@ -2698,7 +3085,7 @@
     </w:p>
     <w:p>
       <w:pPr>
-        <w:pStyle w:val="Linhahorizontal"/>
+        <w:pStyle w:val="Linhahorizontaluser"/>
         <w:bidi w:val="0"/>
         <w:rPr/>
       </w:pPr>
@@ -2736,7 +3123,6 @@
           <w:numId w:val="10"/>
         </w:numPr>
         <w:tabs>
-          <w:tab w:val="clear" w:pos="709"/>
           <w:tab w:val="left" w:pos="709" w:leader="none"/>
         </w:tabs>
         <w:bidi w:val="0"/>
@@ -2756,7 +3142,6 @@
           <w:numId w:val="10"/>
         </w:numPr>
         <w:tabs>
-          <w:tab w:val="clear" w:pos="709"/>
           <w:tab w:val="left" w:pos="709" w:leader="none"/>
         </w:tabs>
         <w:bidi w:val="0"/>
@@ -2776,7 +3161,6 @@
           <w:numId w:val="10"/>
         </w:numPr>
         <w:tabs>
-          <w:tab w:val="clear" w:pos="709"/>
           <w:tab w:val="left" w:pos="709" w:leader="none"/>
         </w:tabs>
         <w:bidi w:val="0"/>
@@ -2796,7 +3180,6 @@
           <w:numId w:val="10"/>
         </w:numPr>
         <w:tabs>
-          <w:tab w:val="clear" w:pos="709"/>
           <w:tab w:val="left" w:pos="709" w:leader="none"/>
         </w:tabs>
         <w:bidi w:val="0"/>
@@ -2831,7 +3214,7 @@
     </w:p>
     <w:p>
       <w:pPr>
-        <w:pStyle w:val="Linhahorizontal"/>
+        <w:pStyle w:val="Linhahorizontaluser"/>
         <w:bidi w:val="0"/>
         <w:rPr/>
       </w:pPr>
@@ -2880,7 +3263,6 @@
           <w:numId w:val="11"/>
         </w:numPr>
         <w:tabs>
-          <w:tab w:val="clear" w:pos="709"/>
           <w:tab w:val="left" w:pos="709" w:leader="none"/>
         </w:tabs>
         <w:bidi w:val="0"/>
@@ -2900,7 +3282,6 @@
           <w:numId w:val="11"/>
         </w:numPr>
         <w:tabs>
-          <w:tab w:val="clear" w:pos="709"/>
           <w:tab w:val="left" w:pos="709" w:leader="none"/>
         </w:tabs>
         <w:bidi w:val="0"/>
@@ -2920,7 +3301,6 @@
           <w:numId w:val="11"/>
         </w:numPr>
         <w:tabs>
-          <w:tab w:val="clear" w:pos="709"/>
           <w:tab w:val="left" w:pos="709" w:leader="none"/>
         </w:tabs>
         <w:bidi w:val="0"/>
@@ -2940,7 +3320,6 @@
           <w:numId w:val="11"/>
         </w:numPr>
         <w:tabs>
-          <w:tab w:val="clear" w:pos="709"/>
           <w:tab w:val="left" w:pos="709" w:leader="none"/>
         </w:tabs>
         <w:bidi w:val="0"/>
@@ -2960,7 +3339,6 @@
           <w:numId w:val="11"/>
         </w:numPr>
         <w:tabs>
-          <w:tab w:val="clear" w:pos="709"/>
           <w:tab w:val="left" w:pos="709" w:leader="none"/>
         </w:tabs>
         <w:bidi w:val="0"/>
@@ -2980,7 +3358,6 @@
           <w:numId w:val="11"/>
         </w:numPr>
         <w:tabs>
-          <w:tab w:val="clear" w:pos="709"/>
           <w:tab w:val="left" w:pos="709" w:leader="none"/>
         </w:tabs>
         <w:bidi w:val="0"/>
@@ -3000,7 +3377,6 @@
           <w:numId w:val="11"/>
         </w:numPr>
         <w:tabs>
-          <w:tab w:val="clear" w:pos="709"/>
           <w:tab w:val="left" w:pos="709" w:leader="none"/>
         </w:tabs>
         <w:bidi w:val="0"/>
@@ -3025,7 +3401,7 @@
     </w:p>
     <w:p>
       <w:pPr>
-        <w:pStyle w:val="Linhahorizontal"/>
+        <w:pStyle w:val="Linhahorizontaluser"/>
         <w:bidi w:val="0"/>
         <w:rPr/>
       </w:pPr>
@@ -3085,7 +3461,6 @@
           <w:numId w:val="12"/>
         </w:numPr>
         <w:tabs>
-          <w:tab w:val="clear" w:pos="709"/>
           <w:tab w:val="left" w:pos="709" w:leader="none"/>
         </w:tabs>
         <w:bidi w:val="0"/>
@@ -3105,7 +3480,6 @@
           <w:numId w:val="12"/>
         </w:numPr>
         <w:tabs>
-          <w:tab w:val="clear" w:pos="709"/>
           <w:tab w:val="left" w:pos="709" w:leader="none"/>
         </w:tabs>
         <w:bidi w:val="0"/>
@@ -3125,7 +3499,6 @@
           <w:numId w:val="12"/>
         </w:numPr>
         <w:tabs>
-          <w:tab w:val="clear" w:pos="709"/>
           <w:tab w:val="left" w:pos="709" w:leader="none"/>
         </w:tabs>
         <w:bidi w:val="0"/>
@@ -3145,7 +3518,6 @@
           <w:numId w:val="12"/>
         </w:numPr>
         <w:tabs>
-          <w:tab w:val="clear" w:pos="709"/>
           <w:tab w:val="left" w:pos="709" w:leader="none"/>
         </w:tabs>
         <w:bidi w:val="0"/>
@@ -3165,7 +3537,6 @@
           <w:numId w:val="12"/>
         </w:numPr>
         <w:tabs>
-          <w:tab w:val="clear" w:pos="709"/>
           <w:tab w:val="left" w:pos="709" w:leader="none"/>
         </w:tabs>
         <w:bidi w:val="0"/>
@@ -3185,7 +3556,6 @@
           <w:numId w:val="12"/>
         </w:numPr>
         <w:tabs>
-          <w:tab w:val="clear" w:pos="709"/>
           <w:tab w:val="left" w:pos="709" w:leader="none"/>
         </w:tabs>
         <w:bidi w:val="0"/>
@@ -3205,7 +3575,6 @@
           <w:numId w:val="12"/>
         </w:numPr>
         <w:tabs>
-          <w:tab w:val="clear" w:pos="709"/>
           <w:tab w:val="left" w:pos="709" w:leader="none"/>
         </w:tabs>
         <w:bidi w:val="0"/>
@@ -3225,7 +3594,6 @@
           <w:numId w:val="12"/>
         </w:numPr>
         <w:tabs>
-          <w:tab w:val="clear" w:pos="709"/>
           <w:tab w:val="left" w:pos="709" w:leader="none"/>
         </w:tabs>
         <w:bidi w:val="0"/>
@@ -3245,7 +3613,6 @@
           <w:numId w:val="12"/>
         </w:numPr>
         <w:tabs>
-          <w:tab w:val="clear" w:pos="709"/>
           <w:tab w:val="left" w:pos="709" w:leader="none"/>
         </w:tabs>
         <w:bidi w:val="0"/>
@@ -3265,7 +3632,6 @@
           <w:numId w:val="12"/>
         </w:numPr>
         <w:tabs>
-          <w:tab w:val="clear" w:pos="709"/>
           <w:tab w:val="left" w:pos="709" w:leader="none"/>
         </w:tabs>
         <w:bidi w:val="0"/>
@@ -3300,7 +3666,7 @@
     </w:p>
     <w:p>
       <w:pPr>
-        <w:pStyle w:val="Linhahorizontal"/>
+        <w:pStyle w:val="Linhahorizontaluser"/>
         <w:bidi w:val="0"/>
         <w:rPr/>
       </w:pPr>
@@ -3349,7 +3715,6 @@
           <w:numId w:val="13"/>
         </w:numPr>
         <w:tabs>
-          <w:tab w:val="clear" w:pos="709"/>
           <w:tab w:val="left" w:pos="709" w:leader="none"/>
         </w:tabs>
         <w:bidi w:val="0"/>
@@ -3369,7 +3734,6 @@
           <w:numId w:val="13"/>
         </w:numPr>
         <w:tabs>
-          <w:tab w:val="clear" w:pos="709"/>
           <w:tab w:val="left" w:pos="709" w:leader="none"/>
         </w:tabs>
         <w:bidi w:val="0"/>
@@ -3389,7 +3753,6 @@
           <w:numId w:val="13"/>
         </w:numPr>
         <w:tabs>
-          <w:tab w:val="clear" w:pos="709"/>
           <w:tab w:val="left" w:pos="709" w:leader="none"/>
         </w:tabs>
         <w:bidi w:val="0"/>
@@ -3409,7 +3772,6 @@
           <w:numId w:val="13"/>
         </w:numPr>
         <w:tabs>
-          <w:tab w:val="clear" w:pos="709"/>
           <w:tab w:val="left" w:pos="709" w:leader="none"/>
         </w:tabs>
         <w:bidi w:val="0"/>
@@ -3429,7 +3791,6 @@
           <w:numId w:val="13"/>
         </w:numPr>
         <w:tabs>
-          <w:tab w:val="clear" w:pos="709"/>
           <w:tab w:val="left" w:pos="709" w:leader="none"/>
         </w:tabs>
         <w:bidi w:val="0"/>
@@ -3449,7 +3810,6 @@
           <w:numId w:val="13"/>
         </w:numPr>
         <w:tabs>
-          <w:tab w:val="clear" w:pos="709"/>
           <w:tab w:val="left" w:pos="709" w:leader="none"/>
         </w:tabs>
         <w:bidi w:val="0"/>
@@ -3474,7 +3834,7 @@
     </w:p>
     <w:p>
       <w:pPr>
-        <w:pStyle w:val="Linhahorizontal"/>
+        <w:pStyle w:val="Linhahorizontaluser"/>
         <w:bidi w:val="0"/>
         <w:rPr/>
       </w:pPr>
@@ -3534,7 +3894,6 @@
           <w:numId w:val="14"/>
         </w:numPr>
         <w:tabs>
-          <w:tab w:val="clear" w:pos="709"/>
           <w:tab w:val="left" w:pos="709" w:leader="none"/>
         </w:tabs>
         <w:bidi w:val="0"/>
@@ -3554,7 +3913,6 @@
           <w:numId w:val="14"/>
         </w:numPr>
         <w:tabs>
-          <w:tab w:val="clear" w:pos="709"/>
           <w:tab w:val="left" w:pos="709" w:leader="none"/>
         </w:tabs>
         <w:bidi w:val="0"/>
@@ -3574,7 +3932,6 @@
           <w:numId w:val="14"/>
         </w:numPr>
         <w:tabs>
-          <w:tab w:val="clear" w:pos="709"/>
           <w:tab w:val="left" w:pos="709" w:leader="none"/>
         </w:tabs>
         <w:bidi w:val="0"/>
@@ -3594,7 +3951,6 @@
           <w:numId w:val="14"/>
         </w:numPr>
         <w:tabs>
-          <w:tab w:val="clear" w:pos="709"/>
           <w:tab w:val="left" w:pos="709" w:leader="none"/>
         </w:tabs>
         <w:bidi w:val="0"/>
@@ -3614,7 +3970,6 @@
           <w:numId w:val="14"/>
         </w:numPr>
         <w:tabs>
-          <w:tab w:val="clear" w:pos="709"/>
           <w:tab w:val="left" w:pos="709" w:leader="none"/>
         </w:tabs>
         <w:bidi w:val="0"/>
@@ -3634,7 +3989,6 @@
           <w:numId w:val="14"/>
         </w:numPr>
         <w:tabs>
-          <w:tab w:val="clear" w:pos="709"/>
           <w:tab w:val="left" w:pos="709" w:leader="none"/>
         </w:tabs>
         <w:bidi w:val="0"/>
@@ -3654,7 +4008,6 @@
           <w:numId w:val="14"/>
         </w:numPr>
         <w:tabs>
-          <w:tab w:val="clear" w:pos="709"/>
           <w:tab w:val="left" w:pos="709" w:leader="none"/>
         </w:tabs>
         <w:bidi w:val="0"/>
@@ -3692,7 +4045,7 @@
     </w:p>
     <w:p>
       <w:pPr>
-        <w:pStyle w:val="Linhahorizontal"/>
+        <w:pStyle w:val="Linhahorizontaluser"/>
         <w:bidi w:val="0"/>
         <w:rPr/>
       </w:pPr>
@@ -3730,7 +4083,6 @@
           <w:numId w:val="15"/>
         </w:numPr>
         <w:tabs>
-          <w:tab w:val="clear" w:pos="709"/>
           <w:tab w:val="left" w:pos="709" w:leader="none"/>
         </w:tabs>
         <w:bidi w:val="0"/>
@@ -3750,7 +4102,6 @@
           <w:numId w:val="15"/>
         </w:numPr>
         <w:tabs>
-          <w:tab w:val="clear" w:pos="709"/>
           <w:tab w:val="left" w:pos="709" w:leader="none"/>
         </w:tabs>
         <w:bidi w:val="0"/>
@@ -3770,7 +4121,6 @@
           <w:numId w:val="15"/>
         </w:numPr>
         <w:tabs>
-          <w:tab w:val="clear" w:pos="709"/>
           <w:tab w:val="left" w:pos="709" w:leader="none"/>
         </w:tabs>
         <w:bidi w:val="0"/>
@@ -3790,7 +4140,6 @@
           <w:numId w:val="15"/>
         </w:numPr>
         <w:tabs>
-          <w:tab w:val="clear" w:pos="709"/>
           <w:tab w:val="left" w:pos="709" w:leader="none"/>
         </w:tabs>
         <w:bidi w:val="0"/>
@@ -3810,7 +4159,6 @@
           <w:numId w:val="15"/>
         </w:numPr>
         <w:tabs>
-          <w:tab w:val="clear" w:pos="709"/>
           <w:tab w:val="left" w:pos="709" w:leader="none"/>
         </w:tabs>
         <w:bidi w:val="0"/>
@@ -3830,7 +4178,6 @@
           <w:numId w:val="15"/>
         </w:numPr>
         <w:tabs>
-          <w:tab w:val="clear" w:pos="709"/>
           <w:tab w:val="left" w:pos="709" w:leader="none"/>
         </w:tabs>
         <w:bidi w:val="0"/>
@@ -3850,7 +4197,6 @@
           <w:numId w:val="15"/>
         </w:numPr>
         <w:tabs>
-          <w:tab w:val="clear" w:pos="709"/>
           <w:tab w:val="left" w:pos="709" w:leader="none"/>
         </w:tabs>
         <w:bidi w:val="0"/>
@@ -3896,7 +4242,7 @@
     </w:p>
     <w:p>
       <w:pPr>
-        <w:pStyle w:val="Linhahorizontal"/>
+        <w:pStyle w:val="Linhahorizontaluser"/>
         <w:bidi w:val="0"/>
         <w:rPr/>
       </w:pPr>
@@ -3923,18 +4269,42 @@
       </w:pPr>
       <w:r>
         <w:rPr/>
-        <w:t>Antes da publicação do artigo, recomendo realizar uma pequena validação humana da classificação qualitativa.</w:t>
-      </w:r>
-    </w:p>
-    <w:p>
-      <w:pPr>
-        <w:pStyle w:val="BodyText"/>
-        <w:bidi w:val="0"/>
-        <w:rPr/>
-      </w:pPr>
-      <w:r>
-        <w:rPr/>
-        <w:t>A ideia é selecionar uma amostra das respostas abertas e pedir que a professora/pesquisadores classifiquem manualmente as respostas utilizando exatamente a mesma taxonomia.</w:t>
+        <w:t>Antes da publicação d</w:t>
+      </w:r>
+      <w:r>
+        <w:rPr/>
+        <w:t>e qualquer</w:t>
+      </w:r>
+      <w:r>
+        <w:rPr/>
+        <w:t xml:space="preserve"> artigo, </w:t>
+      </w:r>
+      <w:r>
+        <w:rPr/>
+        <w:t>deve-se</w:t>
+      </w:r>
+      <w:r>
+        <w:rPr/>
+        <w:t xml:space="preserve"> realizar uma pequena validação humana da classificação qualitativa.</w:t>
+      </w:r>
+    </w:p>
+    <w:p>
+      <w:pPr>
+        <w:pStyle w:val="BodyText"/>
+        <w:bidi w:val="0"/>
+        <w:rPr/>
+      </w:pPr>
+      <w:r>
+        <w:rPr/>
+        <w:t>A ideia é selecionar uma amostra das respostas abertas e classifi</w:t>
+      </w:r>
+      <w:r>
+        <w:rPr/>
+        <w:t>car</w:t>
+      </w:r>
+      <w:r>
+        <w:rPr/>
+        <w:t xml:space="preserve"> manualmente utilizando exatamente a mesma taxonomia.</w:t>
       </w:r>
     </w:p>
     <w:p>
@@ -3996,7 +4366,7 @@
     </w:p>
     <w:p>
       <w:pPr>
-        <w:pStyle w:val="Linhahorizontal"/>
+        <w:pStyle w:val="Linhahorizontaluser"/>
         <w:bidi w:val="0"/>
         <w:rPr/>
       </w:pPr>
@@ -4039,7 +4409,7 @@
     </w:p>
     <w:p>
       <w:pPr>
-        <w:pStyle w:val="Blocodecitao"/>
+        <w:pStyle w:val="Blocodecitaouser"/>
         <w:bidi w:val="0"/>
         <w:rPr/>
       </w:pPr>
@@ -4065,7 +4435,7 @@
     </w:p>
     <w:p>
       <w:pPr>
-        <w:pStyle w:val="Blocodecitao"/>
+        <w:pStyle w:val="Blocodecitaouser"/>
         <w:bidi w:val="0"/>
         <w:rPr/>
       </w:pPr>
@@ -4091,7 +4461,7 @@
     </w:p>
     <w:p>
       <w:pPr>
-        <w:pStyle w:val="Blocodecitao"/>
+        <w:pStyle w:val="Blocodecitaouser"/>
         <w:bidi w:val="0"/>
         <w:rPr/>
       </w:pPr>
@@ -4117,7 +4487,7 @@
     </w:p>
     <w:p>
       <w:pPr>
-        <w:pStyle w:val="Blocodecitao"/>
+        <w:pStyle w:val="Blocodecitaouser"/>
         <w:bidi w:val="0"/>
         <w:rPr/>
       </w:pPr>
@@ -4154,7 +4524,7 @@
     </w:p>
     <w:p>
       <w:pPr>
-        <w:pStyle w:val="Linhahorizontal"/>
+        <w:pStyle w:val="Linhahorizontaluser"/>
         <w:bidi w:val="0"/>
         <w:rPr/>
       </w:pPr>
@@ -4170,7 +4540,15 @@
       </w:pPr>
       <w:r>
         <w:rPr/>
-        <w:t>10. O resultado esperado para o artigo</w:t>
+        <w:t xml:space="preserve">10. O resultado esperado para </w:t>
+      </w:r>
+      <w:r>
+        <w:rPr/>
+        <w:t>um</w:t>
+      </w:r>
+      <w:r>
+        <w:rPr/>
+        <w:t xml:space="preserve"> artigo</w:t>
       </w:r>
     </w:p>
     <w:p>
@@ -4282,7 +4660,7 @@
     </w:p>
     <w:p>
       <w:pPr>
-        <w:pStyle w:val="Linhahorizontal"/>
+        <w:pStyle w:val="Linhahorizontaluser"/>
         <w:bidi w:val="0"/>
         <w:rPr/>
       </w:pPr>
@@ -4331,7 +4709,6 @@
           <w:numId w:val="16"/>
         </w:numPr>
         <w:tabs>
-          <w:tab w:val="clear" w:pos="709"/>
           <w:tab w:val="left" w:pos="709" w:leader="none"/>
         </w:tabs>
         <w:bidi w:val="0"/>
@@ -4351,7 +4728,6 @@
           <w:numId w:val="16"/>
         </w:numPr>
         <w:tabs>
-          <w:tab w:val="clear" w:pos="709"/>
           <w:tab w:val="left" w:pos="709" w:leader="none"/>
         </w:tabs>
         <w:bidi w:val="0"/>
@@ -4371,7 +4747,6 @@
           <w:numId w:val="16"/>
         </w:numPr>
         <w:tabs>
-          <w:tab w:val="clear" w:pos="709"/>
           <w:tab w:val="left" w:pos="709" w:leader="none"/>
         </w:tabs>
         <w:bidi w:val="0"/>
@@ -4391,7 +4766,6 @@
           <w:numId w:val="16"/>
         </w:numPr>
         <w:tabs>
-          <w:tab w:val="clear" w:pos="709"/>
           <w:tab w:val="left" w:pos="709" w:leader="none"/>
         </w:tabs>
         <w:bidi w:val="0"/>
@@ -4411,7 +4785,6 @@
           <w:numId w:val="16"/>
         </w:numPr>
         <w:tabs>
-          <w:tab w:val="clear" w:pos="709"/>
           <w:tab w:val="left" w:pos="709" w:leader="none"/>
         </w:tabs>
         <w:bidi w:val="0"/>
@@ -4431,7 +4804,6 @@
           <w:numId w:val="16"/>
         </w:numPr>
         <w:tabs>
-          <w:tab w:val="clear" w:pos="709"/>
           <w:tab w:val="left" w:pos="709" w:leader="none"/>
         </w:tabs>
         <w:bidi w:val="0"/>
@@ -4451,7 +4823,6 @@
           <w:numId w:val="16"/>
         </w:numPr>
         <w:tabs>
-          <w:tab w:val="clear" w:pos="709"/>
           <w:tab w:val="left" w:pos="709" w:leader="none"/>
         </w:tabs>
         <w:bidi w:val="0"/>
@@ -4471,7 +4842,6 @@
           <w:numId w:val="16"/>
         </w:numPr>
         <w:tabs>
-          <w:tab w:val="clear" w:pos="709"/>
           <w:tab w:val="left" w:pos="709" w:leader="none"/>
         </w:tabs>
         <w:bidi w:val="0"/>
@@ -4513,7 +4883,6 @@
           <w:numId w:val="17"/>
         </w:numPr>
         <w:tabs>
-          <w:tab w:val="clear" w:pos="709"/>
           <w:tab w:val="left" w:pos="709" w:leader="none"/>
         </w:tabs>
         <w:bidi w:val="0"/>
@@ -4533,7 +4902,6 @@
           <w:numId w:val="17"/>
         </w:numPr>
         <w:tabs>
-          <w:tab w:val="clear" w:pos="709"/>
           <w:tab w:val="left" w:pos="709" w:leader="none"/>
         </w:tabs>
         <w:bidi w:val="0"/>
@@ -4553,7 +4921,6 @@
           <w:numId w:val="17"/>
         </w:numPr>
         <w:tabs>
-          <w:tab w:val="clear" w:pos="709"/>
           <w:tab w:val="left" w:pos="709" w:leader="none"/>
         </w:tabs>
         <w:bidi w:val="0"/>
@@ -4573,7 +4940,6 @@
           <w:numId w:val="17"/>
         </w:numPr>
         <w:tabs>
-          <w:tab w:val="clear" w:pos="709"/>
           <w:tab w:val="left" w:pos="709" w:leader="none"/>
         </w:tabs>
         <w:bidi w:val="0"/>
@@ -4593,7 +4959,6 @@
           <w:numId w:val="17"/>
         </w:numPr>
         <w:tabs>
-          <w:tab w:val="clear" w:pos="709"/>
           <w:tab w:val="left" w:pos="709" w:leader="none"/>
         </w:tabs>
         <w:bidi w:val="0"/>
@@ -4613,7 +4978,6 @@
           <w:numId w:val="17"/>
         </w:numPr>
         <w:tabs>
-          <w:tab w:val="clear" w:pos="709"/>
           <w:tab w:val="left" w:pos="709" w:leader="none"/>
         </w:tabs>
         <w:bidi w:val="0"/>
@@ -4633,7 +4997,6 @@
           <w:numId w:val="17"/>
         </w:numPr>
         <w:tabs>
-          <w:tab w:val="clear" w:pos="709"/>
           <w:tab w:val="left" w:pos="709" w:leader="none"/>
         </w:tabs>
         <w:bidi w:val="0"/>
@@ -4653,7 +5016,6 @@
           <w:numId w:val="17"/>
         </w:numPr>
         <w:tabs>
-          <w:tab w:val="clear" w:pos="709"/>
           <w:tab w:val="left" w:pos="709" w:leader="none"/>
         </w:tabs>
         <w:bidi w:val="0"/>
@@ -4684,7 +5046,7 @@
     </w:p>
     <w:p>
       <w:pPr>
-        <w:pStyle w:val="Linhahorizontal"/>
+        <w:pStyle w:val="Linhahorizontaluser"/>
         <w:bidi w:val="0"/>
         <w:rPr/>
       </w:pPr>
@@ -4945,7 +5307,7 @@
     </w:p>
     <w:p>
       <w:pPr>
-        <w:pStyle w:val="Linhahorizontal"/>
+        <w:pStyle w:val="Linhahorizontaluser"/>
         <w:bidi w:val="0"/>
         <w:rPr/>
       </w:pPr>
@@ -4972,15 +5334,7 @@
       </w:pPr>
       <w:r>
         <w:rPr/>
-        <w:t xml:space="preserve">O sistema </w:t>
-      </w:r>
-      <w:r>
-        <w:rPr/>
-        <w:t>e</w:t>
-      </w:r>
-      <w:r>
-        <w:rPr/>
-        <w:t xml:space="preserve">stá funcionando como uma </w:t>
+        <w:t xml:space="preserve">O sistema está funcionando como uma </w:t>
       </w:r>
       <w:r>
         <w:rPr>
@@ -5052,6 +5406,7 @@
       <w:pgNumType w:fmt="decimal"/>
       <w:formProt w:val="false"/>
       <w:textDirection w:val="lrTb"/>
+      <w:docGrid w:type="default" w:linePitch="100" w:charSpace="0"/>
     </w:sectPr>
   </w:body>
 </w:document>
@@ -7374,7 +7729,6 @@
     <w:lvl w:ilvl="0">
       <w:start w:val="1"/>
       <w:numFmt w:val="none"/>
-      <w:pStyle w:val="Heading1"/>
       <w:suff w:val="nothing"/>
       <w:lvlText w:val=""/>
       <w:lvlJc w:val="start"/>
@@ -7388,7 +7742,6 @@
     <w:lvl w:ilvl="1">
       <w:start w:val="1"/>
       <w:numFmt w:val="none"/>
-      <w:pStyle w:val="Heading2"/>
       <w:suff w:val="nothing"/>
       <w:lvlText w:val=""/>
       <w:lvlJc w:val="start"/>
@@ -7402,7 +7755,6 @@
     <w:lvl w:ilvl="2">
       <w:start w:val="1"/>
       <w:numFmt w:val="none"/>
-      <w:pStyle w:val="Heading3"/>
       <w:suff w:val="nothing"/>
       <w:lvlText w:val=""/>
       <w:lvlJc w:val="start"/>
@@ -7563,7 +7915,6 @@
     </w:rPrDefault>
     <w:pPrDefault>
       <w:pPr>
-        <w:widowControl/>
         <w:suppressAutoHyphens w:val="true"/>
       </w:pPr>
     </w:pPrDefault>
@@ -7573,7 +7924,10 @@
     <w:qFormat/>
     <w:pPr>
       <w:widowControl/>
+      <w:suppressAutoHyphens w:val="true"/>
       <w:bidi w:val="0"/>
+      <w:spacing w:before="0" w:after="0"/>
+      <w:jc w:val="start"/>
     </w:pPr>
     <w:rPr>
       <w:rFonts w:ascii="Liberation Serif" w:hAnsi="Liberation Serif" w:eastAsia="NSimSun" w:cs="Arial"/>
@@ -7586,7 +7940,7 @@
   </w:style>
   <w:style w:type="paragraph" w:styleId="Heading1">
     <w:name w:val="heading 1"/>
-    <w:basedOn w:val="Ttulo"/>
+    <w:basedOn w:val="Ttulouser"/>
     <w:next w:val="BodyText"/>
     <w:qFormat/>
     <w:pPr>
@@ -7603,7 +7957,7 @@
   </w:style>
   <w:style w:type="paragraph" w:styleId="Heading2">
     <w:name w:val="heading 2"/>
-    <w:basedOn w:val="Ttulo"/>
+    <w:basedOn w:val="Ttulouser"/>
     <w:next w:val="BodyText"/>
     <w:qFormat/>
     <w:pPr>
@@ -7620,7 +7974,7 @@
   </w:style>
   <w:style w:type="paragraph" w:styleId="Heading3">
     <w:name w:val="heading 3"/>
-    <w:basedOn w:val="Ttulo"/>
+    <w:basedOn w:val="Ttulouser"/>
     <w:next w:val="BodyText"/>
     <w:qFormat/>
     <w:pPr>
@@ -7643,15 +7997,15 @@
       <w:bCs/>
     </w:rPr>
   </w:style>
-  <w:style w:type="character" w:styleId="Marcadores">
-    <w:name w:val="Marcadores"/>
+  <w:style w:type="character" w:styleId="Marcadoresuser">
+    <w:name w:val="Marcadores (user)"/>
     <w:qFormat/>
     <w:rPr>
       <w:rFonts w:ascii="OpenSymbol" w:hAnsi="OpenSymbol" w:eastAsia="OpenSymbol" w:cs="OpenSymbol"/>
     </w:rPr>
   </w:style>
-  <w:style w:type="character" w:styleId="Smbolosdenumerao">
-    <w:name w:val="Símbolos de numeração"/>
+  <w:style w:type="character" w:styleId="Smbolosdenumeraouser">
+    <w:name w:val="Símbolos de numeração (user)"/>
     <w:qFormat/>
     <w:rPr/>
   </w:style>
@@ -7659,7 +8013,6 @@
     <w:name w:val="Título"/>
     <w:basedOn w:val="Normal"/>
     <w:next w:val="BodyText"/>
-    <w:qFormat/>
     <w:pPr>
       <w:keepNext w:val="true"/>
       <w:spacing w:before="240" w:after="120"/>
@@ -7705,6 +8058,31 @@
   <w:style w:type="paragraph" w:styleId="ndice">
     <w:name w:val="Índice"/>
     <w:basedOn w:val="Normal"/>
+    <w:pPr>
+      <w:suppressLineNumbers/>
+    </w:pPr>
+    <w:rPr>
+      <w:rFonts w:cs="Arial"/>
+    </w:rPr>
+  </w:style>
+  <w:style w:type="paragraph" w:styleId="Ttulouser">
+    <w:name w:val="Título (user)"/>
+    <w:basedOn w:val="Normal"/>
+    <w:next w:val="BodyText"/>
+    <w:qFormat/>
+    <w:pPr>
+      <w:keepNext w:val="true"/>
+      <w:spacing w:before="240" w:after="120"/>
+    </w:pPr>
+    <w:rPr>
+      <w:rFonts w:ascii="Liberation Sans" w:hAnsi="Liberation Sans" w:eastAsia="Microsoft YaHei" w:cs="Arial"/>
+      <w:sz w:val="28"/>
+      <w:szCs w:val="28"/>
+    </w:rPr>
+  </w:style>
+  <w:style w:type="paragraph" w:styleId="ndiceuser">
+    <w:name w:val="Índice (user)"/>
+    <w:basedOn w:val="Normal"/>
     <w:qFormat/>
     <w:pPr>
       <w:suppressLineNumbers/>
@@ -7713,8 +8091,8 @@
       <w:rFonts w:cs="Arial"/>
     </w:rPr>
   </w:style>
-  <w:style w:type="paragraph" w:styleId="Linhahorizontal">
-    <w:name w:val="Linha horizontal"/>
+  <w:style w:type="paragraph" w:styleId="Linhahorizontaluser">
+    <w:name w:val="Linha horizontal (user)"/>
     <w:basedOn w:val="Normal"/>
     <w:next w:val="BodyText"/>
     <w:qFormat/>
@@ -7730,10 +8108,19 @@
       <w:szCs w:val="12"/>
     </w:rPr>
   </w:style>
+  <w:style w:type="paragraph" w:styleId="Blocodecitaouser">
+    <w:name w:val="Bloco de citação (user)"/>
+    <w:basedOn w:val="Normal"/>
+    <w:qFormat/>
+    <w:pPr>
+      <w:spacing w:before="0" w:after="283"/>
+      <w:ind w:hanging="0" w:start="567" w:end="567"/>
+    </w:pPr>
+    <w:rPr/>
+  </w:style>
   <w:style w:type="paragraph" w:styleId="Blocodecitao">
     <w:name w:val="Bloco de citação"/>
     <w:basedOn w:val="Normal"/>
-    <w:qFormat/>
     <w:pPr>
       <w:spacing w:before="0" w:after="283"/>
       <w:ind w:hanging="0" w:start="567" w:end="567"/>

</xml_diff>